<commit_message>
Replace grid tables in Table of Contents with standard dot-leader indexed format
</commit_message>
<xml_diff>
--- a/HAAZIR_Minor_Project_Synopsis.docx
+++ b/HAAZIR_Minor_Project_Synopsis.docx
@@ -1278,37 +1278,33 @@
           <w:color w:val="000000"/>
           <w:sz w:val="28"/>
         </w:rPr>
-        <w:t>TABLE OF CONTENTS</w:t>
+        <w:t>4. TABLE OF CONTENTS</w:t>
       </w:r>
     </w:p>
     <w:p>
       <w:pPr>
+        <w:spacing w:before="40" w:after="40" w:lineRule="auto" w:line="276"/>
         <w:tabs>
-          <w:tab w:pos="8669" w:val="right" w:leader="dot"/>
+          <w:tab w:val="right" w:leader="dot" w:pos="8668"/>
         </w:tabs>
-        <w:spacing w:before="40" w:after="40" w:line="276" w:lineRule="auto"/>
       </w:pPr>
       <w:r>
         <w:rPr>
           <w:rFonts w:ascii="Times New Roman" w:hAnsi="Times New Roman"/>
           <w:b/>
+          <w:color w:val="000000"/>
           <w:sz w:val="22"/>
         </w:rPr>
-        <w:t>1</w:t>
-        <w:tab/>
-        <w:t>Title / Cover Page</w:t>
+        <w:t>1. Title / Cover Page</w:t>
       </w:r>
       <w:r>
-        <w:rPr>
-          <w:rFonts w:ascii="Times New Roman" w:hAnsi="Times New Roman"/>
-          <w:sz w:val="22"/>
-        </w:rPr>
         <w:tab/>
       </w:r>
       <w:r>
         <w:rPr>
           <w:rFonts w:ascii="Times New Roman" w:hAnsi="Times New Roman"/>
           <w:b/>
+          <w:color w:val="000000"/>
           <w:sz w:val="22"/>
         </w:rPr>
         <w:t>i</w:t>
@@ -1316,32 +1312,28 @@
     </w:p>
     <w:p>
       <w:pPr>
+        <w:spacing w:before="40" w:after="40" w:lineRule="auto" w:line="276"/>
         <w:tabs>
-          <w:tab w:pos="8669" w:val="right" w:leader="dot"/>
+          <w:tab w:val="right" w:leader="dot" w:pos="8668"/>
         </w:tabs>
-        <w:spacing w:before="40" w:after="40" w:line="276" w:lineRule="auto"/>
       </w:pPr>
       <w:r>
         <w:rPr>
           <w:rFonts w:ascii="Times New Roman" w:hAnsi="Times New Roman"/>
           <w:b/>
+          <w:color w:val="000000"/>
           <w:sz w:val="22"/>
         </w:rPr>
-        <w:t>2</w:t>
-        <w:tab/>
-        <w:t>Acknowledgment</w:t>
+        <w:t>2. Acknowledgment</w:t>
       </w:r>
       <w:r>
-        <w:rPr>
-          <w:rFonts w:ascii="Times New Roman" w:hAnsi="Times New Roman"/>
-          <w:sz w:val="22"/>
-        </w:rPr>
         <w:tab/>
       </w:r>
       <w:r>
         <w:rPr>
           <w:rFonts w:ascii="Times New Roman" w:hAnsi="Times New Roman"/>
           <w:b/>
+          <w:color w:val="000000"/>
           <w:sz w:val="22"/>
         </w:rPr>
         <w:t>ii</w:t>
@@ -1349,65 +1341,28 @@
     </w:p>
     <w:p>
       <w:pPr>
+        <w:spacing w:before="40" w:after="40" w:lineRule="auto" w:line="276"/>
         <w:tabs>
-          <w:tab w:pos="8669" w:val="right" w:leader="dot"/>
+          <w:tab w:val="right" w:leader="dot" w:pos="8668"/>
         </w:tabs>
-        <w:spacing w:before="40" w:after="40" w:line="276" w:lineRule="auto"/>
       </w:pPr>
       <w:r>
         <w:rPr>
           <w:rFonts w:ascii="Times New Roman" w:hAnsi="Times New Roman"/>
           <w:b/>
+          <w:color w:val="000000"/>
           <w:sz w:val="22"/>
         </w:rPr>
-        <w:t>3</w:t>
-        <w:tab/>
-        <w:t>Institutional Certificate</w:t>
+        <w:t>3. Institutional Training / Lab Certificate</w:t>
       </w:r>
       <w:r>
-        <w:rPr>
-          <w:rFonts w:ascii="Times New Roman" w:hAnsi="Times New Roman"/>
-          <w:sz w:val="22"/>
-        </w:rPr>
         <w:tab/>
       </w:r>
       <w:r>
         <w:rPr>
           <w:rFonts w:ascii="Times New Roman" w:hAnsi="Times New Roman"/>
           <w:b/>
-          <w:sz w:val="22"/>
-        </w:rPr>
-        <w:t>iii</w:t>
-      </w:r>
-    </w:p>
-    <w:p>
-      <w:pPr>
-        <w:tabs>
-          <w:tab w:pos="8669" w:val="right" w:leader="dot"/>
-        </w:tabs>
-        <w:spacing w:before="40" w:after="40" w:line="276" w:lineRule="auto"/>
-      </w:pPr>
-      <w:r>
-        <w:rPr>
-          <w:rFonts w:ascii="Times New Roman" w:hAnsi="Times New Roman"/>
-          <w:b/>
-          <w:sz w:val="22"/>
-        </w:rPr>
-        <w:t>4</w:t>
-        <w:tab/>
-        <w:t>Table of Contents / List of Figures / List of Tables</w:t>
-      </w:r>
-      <w:r>
-        <w:rPr>
-          <w:rFonts w:ascii="Times New Roman" w:hAnsi="Times New Roman"/>
-          <w:sz w:val="22"/>
-        </w:rPr>
-        <w:tab/>
-      </w:r>
-      <w:r>
-        <w:rPr>
-          <w:rFonts w:ascii="Times New Roman" w:hAnsi="Times New Roman"/>
-          <w:b/>
+          <w:color w:val="000000"/>
           <w:sz w:val="22"/>
         </w:rPr>
         <w:t>iv</w:t>
@@ -1415,32 +1370,57 @@
     </w:p>
     <w:p>
       <w:pPr>
+        <w:spacing w:before="40" w:after="40" w:lineRule="auto" w:line="276"/>
         <w:tabs>
-          <w:tab w:pos="8669" w:val="right" w:leader="dot"/>
+          <w:tab w:val="right" w:leader="dot" w:pos="8668"/>
         </w:tabs>
-        <w:spacing w:before="40" w:after="40" w:line="276" w:lineRule="auto"/>
       </w:pPr>
       <w:r>
         <w:rPr>
           <w:rFonts w:ascii="Times New Roman" w:hAnsi="Times New Roman"/>
           <w:b/>
+          <w:color w:val="000000"/>
           <w:sz w:val="22"/>
         </w:rPr>
-        <w:t>5</w:t>
-        <w:tab/>
-        <w:t>Chapter 1: Abstract</w:t>
+        <w:t>4. Table of Contents / List of Figures / List of Tables</w:t>
       </w:r>
       <w:r>
-        <w:rPr>
-          <w:rFonts w:ascii="Times New Roman" w:hAnsi="Times New Roman"/>
-          <w:sz w:val="22"/>
-        </w:rPr>
         <w:tab/>
       </w:r>
       <w:r>
         <w:rPr>
           <w:rFonts w:ascii="Times New Roman" w:hAnsi="Times New Roman"/>
           <w:b/>
+          <w:color w:val="000000"/>
+          <w:sz w:val="22"/>
+        </w:rPr>
+        <w:t>v</w:t>
+      </w:r>
+    </w:p>
+    <w:p>
+      <w:pPr>
+        <w:spacing w:before="40" w:after="40" w:lineRule="auto" w:line="276"/>
+        <w:tabs>
+          <w:tab w:val="right" w:leader="dot" w:pos="8668"/>
+        </w:tabs>
+      </w:pPr>
+      <w:r>
+        <w:rPr>
+          <w:rFonts w:ascii="Times New Roman" w:hAnsi="Times New Roman"/>
+          <w:b/>
+          <w:color w:val="000000"/>
+          <w:sz w:val="22"/>
+        </w:rPr>
+        <w:t>5. Abstract</w:t>
+      </w:r>
+      <w:r>
+        <w:tab/>
+      </w:r>
+      <w:r>
+        <w:rPr>
+          <w:rFonts w:ascii="Times New Roman" w:hAnsi="Times New Roman"/>
+          <w:b/>
+          <w:color w:val="000000"/>
           <w:sz w:val="22"/>
         </w:rPr>
         <w:t>1</w:t>
@@ -1448,327 +1428,260 @@
     </w:p>
     <w:p>
       <w:pPr>
+        <w:spacing w:before="40" w:after="40" w:lineRule="auto" w:line="276"/>
         <w:tabs>
-          <w:tab w:pos="8669" w:val="right" w:leader="dot"/>
+          <w:tab w:val="right" w:leader="dot" w:pos="8668"/>
         </w:tabs>
-        <w:spacing w:before="40" w:after="40" w:line="276" w:lineRule="auto"/>
       </w:pPr>
       <w:r>
         <w:rPr>
           <w:rFonts w:ascii="Times New Roman" w:hAnsi="Times New Roman"/>
           <w:b/>
+          <w:color w:val="000000"/>
           <w:sz w:val="22"/>
         </w:rPr>
-        <w:t>6</w:t>
-        <w:tab/>
-        <w:t>Chapter 2: Introduction</w:t>
+        <w:t>6. Introduction</w:t>
       </w:r>
       <w:r>
-        <w:rPr>
-          <w:rFonts w:ascii="Times New Roman" w:hAnsi="Times New Roman"/>
-          <w:sz w:val="22"/>
-        </w:rPr>
         <w:tab/>
       </w:r>
       <w:r>
         <w:rPr>
           <w:rFonts w:ascii="Times New Roman" w:hAnsi="Times New Roman"/>
           <w:b/>
+          <w:color w:val="000000"/>
           <w:sz w:val="22"/>
         </w:rPr>
-        <w:t>3</w:t>
+        <w:t>4</w:t>
       </w:r>
     </w:p>
     <w:p>
       <w:pPr>
+        <w:spacing w:before="40" w:after="40" w:lineRule="auto" w:line="276"/>
+        <w:ind w:left="576"/>
         <w:tabs>
-          <w:tab w:pos="8669" w:val="right" w:leader="dot"/>
+          <w:tab w:val="right" w:leader="dot" w:pos="8668"/>
         </w:tabs>
-        <w:spacing w:before="40" w:after="40" w:line="276" w:lineRule="auto"/>
-        <w:ind w:left="432"/>
       </w:pPr>
       <w:r>
         <w:rPr>
           <w:rFonts w:ascii="Times New Roman" w:hAnsi="Times New Roman"/>
+          <w:b w:val="0"/>
+          <w:color w:val="000000"/>
           <w:sz w:val="22"/>
         </w:rPr>
-        <w:t>6.1</w:t>
-        <w:tab/>
-        <w:t>Problem Domain &amp; Indian Attendance Crisis</w:t>
+        <w:t>(i) Problem Domain: The Indian Educational Attendance Crisis</w:t>
       </w:r>
       <w:r>
-        <w:rPr>
-          <w:rFonts w:ascii="Times New Roman" w:hAnsi="Times New Roman"/>
-          <w:sz w:val="22"/>
-        </w:rPr>
         <w:tab/>
       </w:r>
       <w:r>
         <w:rPr>
           <w:rFonts w:ascii="Times New Roman" w:hAnsi="Times New Roman"/>
+          <w:color w:val="000000"/>
           <w:sz w:val="22"/>
         </w:rPr>
-        <w:t>3</w:t>
+        <w:t>4</w:t>
       </w:r>
     </w:p>
     <w:p>
       <w:pPr>
+        <w:spacing w:before="40" w:after="40" w:lineRule="auto" w:line="276"/>
+        <w:ind w:left="576"/>
         <w:tabs>
-          <w:tab w:pos="8669" w:val="right" w:leader="dot"/>
+          <w:tab w:val="right" w:leader="dot" w:pos="8668"/>
         </w:tabs>
-        <w:spacing w:before="40" w:after="40" w:line="276" w:lineRule="auto"/>
-        <w:ind w:left="432"/>
       </w:pPr>
       <w:r>
         <w:rPr>
           <w:rFonts w:ascii="Times New Roman" w:hAnsi="Times New Roman"/>
+          <w:b w:val="0"/>
+          <w:color w:val="000000"/>
           <w:sz w:val="22"/>
         </w:rPr>
-        <w:t>6.2</w:t>
-        <w:tab/>
-        <w:t>About the HAAZIR Project</w:t>
+        <w:t>(ii) About the HAAZIR Project: The Hybrid Philosophy</w:t>
       </w:r>
       <w:r>
-        <w:rPr>
-          <w:rFonts w:ascii="Times New Roman" w:hAnsi="Times New Roman"/>
-          <w:sz w:val="22"/>
-        </w:rPr>
         <w:tab/>
       </w:r>
       <w:r>
         <w:rPr>
           <w:rFonts w:ascii="Times New Roman" w:hAnsi="Times New Roman"/>
+          <w:color w:val="000000"/>
           <w:sz w:val="22"/>
         </w:rPr>
-        <w:t>5</w:t>
+        <w:t>6</w:t>
       </w:r>
     </w:p>
     <w:p>
       <w:pPr>
+        <w:spacing w:before="40" w:after="40" w:lineRule="auto" w:line="276"/>
         <w:tabs>
-          <w:tab w:pos="8669" w:val="right" w:leader="dot"/>
+          <w:tab w:val="right" w:leader="dot" w:pos="8668"/>
         </w:tabs>
-        <w:spacing w:before="40" w:after="40" w:line="276" w:lineRule="auto"/>
       </w:pPr>
       <w:r>
         <w:rPr>
           <w:rFonts w:ascii="Times New Roman" w:hAnsi="Times New Roman"/>
           <w:b/>
+          <w:color w:val="000000"/>
           <w:sz w:val="22"/>
         </w:rPr>
-        <w:t>7</w:t>
-        <w:tab/>
-        <w:t>Chapter 3: Objectives &amp; Key Differentiating Features</w:t>
+        <w:t>7. Objectives &amp; Key Differentiating Features</w:t>
       </w:r>
       <w:r>
-        <w:rPr>
-          <w:rFonts w:ascii="Times New Roman" w:hAnsi="Times New Roman"/>
-          <w:sz w:val="22"/>
-        </w:rPr>
         <w:tab/>
       </w:r>
       <w:r>
         <w:rPr>
           <w:rFonts w:ascii="Times New Roman" w:hAnsi="Times New Roman"/>
           <w:b/>
+          <w:color w:val="000000"/>
           <w:sz w:val="22"/>
         </w:rPr>
-        <w:t>7</w:t>
+        <w:t>8</w:t>
       </w:r>
     </w:p>
     <w:p>
       <w:pPr>
+        <w:spacing w:before="40" w:after="40" w:lineRule="auto" w:line="276"/>
         <w:tabs>
-          <w:tab w:pos="8669" w:val="right" w:leader="dot"/>
+          <w:tab w:val="right" w:leader="dot" w:pos="8668"/>
         </w:tabs>
-        <w:spacing w:before="40" w:after="40" w:line="276" w:lineRule="auto"/>
       </w:pPr>
       <w:r>
         <w:rPr>
           <w:rFonts w:ascii="Times New Roman" w:hAnsi="Times New Roman"/>
           <w:b/>
+          <w:color w:val="000000"/>
           <w:sz w:val="22"/>
         </w:rPr>
-        <w:t>8</w:t>
-        <w:tab/>
-        <w:t>Chapter 4: Project Category &amp; Beneficiary Analysis</w:t>
+        <w:t>8. Project Category &amp; Beneficiary Analysis</w:t>
       </w:r>
       <w:r>
-        <w:rPr>
-          <w:rFonts w:ascii="Times New Roman" w:hAnsi="Times New Roman"/>
-          <w:sz w:val="22"/>
-        </w:rPr>
         <w:tab/>
       </w:r>
       <w:r>
         <w:rPr>
           <w:rFonts w:ascii="Times New Roman" w:hAnsi="Times New Roman"/>
           <w:b/>
+          <w:color w:val="000000"/>
           <w:sz w:val="22"/>
         </w:rPr>
-        <w:t>10</w:t>
+        <w:t>11</w:t>
       </w:r>
     </w:p>
     <w:p>
       <w:pPr>
+        <w:spacing w:before="40" w:after="40" w:lineRule="auto" w:line="276"/>
         <w:tabs>
-          <w:tab w:pos="8669" w:val="right" w:leader="dot"/>
+          <w:tab w:val="right" w:leader="dot" w:pos="8668"/>
         </w:tabs>
-        <w:spacing w:before="40" w:after="40" w:line="276" w:lineRule="auto"/>
       </w:pPr>
       <w:r>
         <w:rPr>
           <w:rFonts w:ascii="Times New Roman" w:hAnsi="Times New Roman"/>
           <w:b/>
+          <w:color w:val="000000"/>
           <w:sz w:val="22"/>
         </w:rPr>
-        <w:t>9</w:t>
-        <w:tab/>
-        <w:t>Chapter 5: Feasibility Study</w:t>
+        <w:t>9. Feasibility Study</w:t>
       </w:r>
       <w:r>
-        <w:rPr>
-          <w:rFonts w:ascii="Times New Roman" w:hAnsi="Times New Roman"/>
-          <w:sz w:val="22"/>
-        </w:rPr>
         <w:tab/>
       </w:r>
       <w:r>
         <w:rPr>
           <w:rFonts w:ascii="Times New Roman" w:hAnsi="Times New Roman"/>
           <w:b/>
+          <w:color w:val="000000"/>
           <w:sz w:val="22"/>
         </w:rPr>
-        <w:t>12</w:t>
+        <w:t>13</w:t>
       </w:r>
     </w:p>
     <w:p>
       <w:pPr>
+        <w:spacing w:before="40" w:after="40" w:lineRule="auto" w:line="276"/>
         <w:tabs>
-          <w:tab w:pos="8669" w:val="right" w:leader="dot"/>
+          <w:tab w:val="right" w:leader="dot" w:pos="8668"/>
         </w:tabs>
-        <w:spacing w:before="40" w:after="40" w:line="276" w:lineRule="auto"/>
       </w:pPr>
       <w:r>
         <w:rPr>
           <w:rFonts w:ascii="Times New Roman" w:hAnsi="Times New Roman"/>
           <w:b/>
+          <w:color w:val="000000"/>
           <w:sz w:val="22"/>
         </w:rPr>
-        <w:t>10</w:t>
-        <w:tab/>
-        <w:t>Chapter 6: Methodology &amp; Planning Work</w:t>
+        <w:t>10. Methodology Used &amp; Planning Work</w:t>
       </w:r>
       <w:r>
-        <w:rPr>
-          <w:rFonts w:ascii="Times New Roman" w:hAnsi="Times New Roman"/>
-          <w:sz w:val="22"/>
-        </w:rPr>
         <w:tab/>
       </w:r>
       <w:r>
         <w:rPr>
           <w:rFonts w:ascii="Times New Roman" w:hAnsi="Times New Roman"/>
           <w:b/>
+          <w:color w:val="000000"/>
           <w:sz w:val="22"/>
         </w:rPr>
-        <w:t>15</w:t>
+        <w:t>17</w:t>
       </w:r>
     </w:p>
     <w:p>
       <w:pPr>
+        <w:spacing w:before="40" w:after="40" w:lineRule="auto" w:line="276"/>
         <w:tabs>
-          <w:tab w:pos="8669" w:val="right" w:leader="dot"/>
+          <w:tab w:val="right" w:leader="dot" w:pos="8668"/>
         </w:tabs>
-        <w:spacing w:before="40" w:after="40" w:line="276" w:lineRule="auto"/>
       </w:pPr>
       <w:r>
         <w:rPr>
           <w:rFonts w:ascii="Times New Roman" w:hAnsi="Times New Roman"/>
           <w:b/>
+          <w:color w:val="000000"/>
           <w:sz w:val="22"/>
         </w:rPr>
-        <w:t>11</w:t>
-        <w:tab/>
-        <w:t>Chapter 7: Tools &amp; Technologies Used</w:t>
+        <w:t>11. Tools &amp; Technologies Used</w:t>
       </w:r>
       <w:r>
-        <w:rPr>
-          <w:rFonts w:ascii="Times New Roman" w:hAnsi="Times New Roman"/>
-          <w:sz w:val="22"/>
-        </w:rPr>
         <w:tab/>
       </w:r>
       <w:r>
         <w:rPr>
           <w:rFonts w:ascii="Times New Roman" w:hAnsi="Times New Roman"/>
           <w:b/>
+          <w:color w:val="000000"/>
           <w:sz w:val="22"/>
         </w:rPr>
-        <w:t>19</w:t>
+        <w:t>21</w:t>
       </w:r>
     </w:p>
     <w:p>
       <w:pPr>
+        <w:spacing w:before="40" w:after="40" w:lineRule="auto" w:line="276"/>
         <w:tabs>
-          <w:tab w:pos="8669" w:val="right" w:leader="dot"/>
+          <w:tab w:val="right" w:leader="dot" w:pos="8668"/>
         </w:tabs>
-        <w:spacing w:before="40" w:after="40" w:line="276" w:lineRule="auto"/>
       </w:pPr>
       <w:r>
         <w:rPr>
           <w:rFonts w:ascii="Times New Roman" w:hAnsi="Times New Roman"/>
           <w:b/>
+          <w:color w:val="000000"/>
           <w:sz w:val="22"/>
         </w:rPr>
-        <w:t>12</w:t>
-        <w:tab/>
-        <w:t>Chapter 8: Platform Used (Hardware &amp; Software)</w:t>
+        <w:t>12. Platform Used (Hardware &amp; Software)</w:t>
       </w:r>
       <w:r>
-        <w:rPr>
-          <w:rFonts w:ascii="Times New Roman" w:hAnsi="Times New Roman"/>
-          <w:sz w:val="22"/>
-        </w:rPr>
         <w:tab/>
       </w:r>
       <w:r>
         <w:rPr>
           <w:rFonts w:ascii="Times New Roman" w:hAnsi="Times New Roman"/>
           <w:b/>
-          <w:sz w:val="22"/>
-        </w:rPr>
-        <w:t>23</w:t>
-      </w:r>
-    </w:p>
-    <w:p>
-      <w:pPr>
-        <w:tabs>
-          <w:tab w:pos="8669" w:val="right" w:leader="dot"/>
-        </w:tabs>
-        <w:spacing w:before="40" w:after="40" w:line="276" w:lineRule="auto"/>
-      </w:pPr>
-      <w:r>
-        <w:rPr>
-          <w:rFonts w:ascii="Times New Roman" w:hAnsi="Times New Roman"/>
-          <w:b/>
-          <w:sz w:val="22"/>
-        </w:rPr>
-        <w:t>13</w:t>
-        <w:tab/>
-        <w:t>Chapter 9: Comprehensive Module Description</w:t>
-      </w:r>
-      <w:r>
-        <w:rPr>
-          <w:rFonts w:ascii="Times New Roman" w:hAnsi="Times New Roman"/>
-          <w:sz w:val="22"/>
-        </w:rPr>
-        <w:tab/>
-      </w:r>
-      <w:r>
-        <w:rPr>
-          <w:rFonts w:ascii="Times New Roman" w:hAnsi="Times New Roman"/>
-          <w:b/>
+          <w:color w:val="000000"/>
           <w:sz w:val="22"/>
         </w:rPr>
         <w:t>25</w:t>
@@ -1776,159 +1689,28 @@
     </w:p>
     <w:p>
       <w:pPr>
+        <w:spacing w:before="40" w:after="40" w:lineRule="auto" w:line="276"/>
         <w:tabs>
-          <w:tab w:pos="8669" w:val="right" w:leader="dot"/>
+          <w:tab w:val="right" w:leader="dot" w:pos="8668"/>
         </w:tabs>
-        <w:spacing w:before="40" w:after="40" w:line="276" w:lineRule="auto"/>
-        <w:ind w:left="432"/>
       </w:pPr>
       <w:r>
         <w:rPr>
           <w:rFonts w:ascii="Times New Roman" w:hAnsi="Times New Roman"/>
+          <w:b/>
+          <w:color w:val="000000"/>
           <w:sz w:val="22"/>
         </w:rPr>
-        <w:t>13.1</w:t>
-        <w:tab/>
-        <w:t>Module 1.0: Core Infrastructure &amp; Multi-Tenant Config Engine</w:t>
+        <w:t>13. Comprehensive Module Description</w:t>
       </w:r>
       <w:r>
-        <w:rPr>
-          <w:rFonts w:ascii="Times New Roman" w:hAnsi="Times New Roman"/>
-          <w:sz w:val="22"/>
-        </w:rPr>
         <w:tab/>
       </w:r>
       <w:r>
         <w:rPr>
           <w:rFonts w:ascii="Times New Roman" w:hAnsi="Times New Roman"/>
-          <w:sz w:val="22"/>
-        </w:rPr>
-        <w:t>25</w:t>
-      </w:r>
-    </w:p>
-    <w:p>
-      <w:pPr>
-        <w:tabs>
-          <w:tab w:pos="8669" w:val="right" w:leader="dot"/>
-        </w:tabs>
-        <w:spacing w:before="40" w:after="40" w:line="276" w:lineRule="auto"/>
-        <w:ind w:left="432"/>
-      </w:pPr>
-      <w:r>
-        <w:rPr>
-          <w:rFonts w:ascii="Times New Roman" w:hAnsi="Times New Roman"/>
-          <w:sz w:val="22"/>
-        </w:rPr>
-        <w:t>13.2</w:t>
-        <w:tab/>
-        <w:t>Module 2.0: Identity, Access &amp; Role-Based Security</w:t>
-      </w:r>
-      <w:r>
-        <w:rPr>
-          <w:rFonts w:ascii="Times New Roman" w:hAnsi="Times New Roman"/>
-          <w:sz w:val="22"/>
-        </w:rPr>
-        <w:tab/>
-      </w:r>
-      <w:r>
-        <w:rPr>
-          <w:rFonts w:ascii="Times New Roman" w:hAnsi="Times New Roman"/>
-          <w:sz w:val="22"/>
-        </w:rPr>
-        <w:t>26</w:t>
-      </w:r>
-    </w:p>
-    <w:p>
-      <w:pPr>
-        <w:tabs>
-          <w:tab w:pos="8669" w:val="right" w:leader="dot"/>
-        </w:tabs>
-        <w:spacing w:before="40" w:after="40" w:line="276" w:lineRule="auto"/>
-        <w:ind w:left="432"/>
-      </w:pPr>
-      <w:r>
-        <w:rPr>
-          <w:rFonts w:ascii="Times New Roman" w:hAnsi="Times New Roman"/>
-          <w:sz w:val="22"/>
-        </w:rPr>
-        <w:t>13.3</w:t>
-        <w:tab/>
-        <w:t>Module 3.0: High-Speed Synthetic Data Engine</w:t>
-      </w:r>
-      <w:r>
-        <w:rPr>
-          <w:rFonts w:ascii="Times New Roman" w:hAnsi="Times New Roman"/>
-          <w:sz w:val="22"/>
-        </w:rPr>
-        <w:tab/>
-      </w:r>
-      <w:r>
-        <w:rPr>
-          <w:rFonts w:ascii="Times New Roman" w:hAnsi="Times New Roman"/>
-          <w:sz w:val="22"/>
-        </w:rPr>
-        <w:t>27</w:t>
-      </w:r>
-    </w:p>
-    <w:p>
-      <w:pPr>
-        <w:tabs>
-          <w:tab w:pos="8669" w:val="right" w:leader="dot"/>
-        </w:tabs>
-        <w:spacing w:before="40" w:after="40" w:line="276" w:lineRule="auto"/>
-        <w:ind w:left="432"/>
-      </w:pPr>
-      <w:r>
-        <w:rPr>
-          <w:rFonts w:ascii="Times New Roman" w:hAnsi="Times New Roman"/>
-          <w:sz w:val="22"/>
-        </w:rPr>
-        <w:t>13.4</w:t>
-        <w:tab/>
-        <w:t>Module 4.0: Student &amp; Academic Management Module</w:t>
-      </w:r>
-      <w:r>
-        <w:rPr>
-          <w:rFonts w:ascii="Times New Roman" w:hAnsi="Times New Roman"/>
-          <w:sz w:val="22"/>
-        </w:rPr>
-        <w:tab/>
-      </w:r>
-      <w:r>
-        <w:rPr>
-          <w:rFonts w:ascii="Times New Roman" w:hAnsi="Times New Roman"/>
-          <w:sz w:val="22"/>
-        </w:rPr>
-        <w:t>27</w:t>
-      </w:r>
-    </w:p>
-    <w:p>
-      <w:pPr>
-        <w:tabs>
-          <w:tab w:pos="8669" w:val="right" w:leader="dot"/>
-        </w:tabs>
-        <w:spacing w:before="40" w:after="40" w:line="276" w:lineRule="auto"/>
-        <w:ind w:left="432"/>
-      </w:pPr>
-      <w:r>
-        <w:rPr>
-          <w:rFonts w:ascii="Times New Roman" w:hAnsi="Times New Roman"/>
-          <w:sz w:val="22"/>
-        </w:rPr>
-        <w:t>13.5</w:t>
-        <w:tab/>
-        <w:t>Module 5.0: YOLO Vision &amp; Register Digitization Engine (FLAGSHIP)</w:t>
-      </w:r>
-      <w:r>
-        <w:rPr>
-          <w:rFonts w:ascii="Times New Roman" w:hAnsi="Times New Roman"/>
-          <w:sz w:val="22"/>
-        </w:rPr>
-        <w:tab/>
-      </w:r>
-      <w:r>
-        <w:rPr>
-          <w:rFonts w:ascii="Times New Roman" w:hAnsi="Times New Roman"/>
+          <w:b/>
+          <w:color w:val="000000"/>
           <w:sz w:val="22"/>
         </w:rPr>
         <w:t>28</w:t>
@@ -1936,31 +1718,86 @@
     </w:p>
     <w:p>
       <w:pPr>
+        <w:spacing w:before="40" w:after="40" w:lineRule="auto" w:line="276"/>
+        <w:ind w:left="576"/>
         <w:tabs>
-          <w:tab w:pos="8669" w:val="right" w:leader="dot"/>
+          <w:tab w:val="right" w:leader="dot" w:pos="8668"/>
         </w:tabs>
-        <w:spacing w:before="40" w:after="40" w:line="276" w:lineRule="auto"/>
-        <w:ind w:left="432"/>
       </w:pPr>
       <w:r>
         <w:rPr>
           <w:rFonts w:ascii="Times New Roman" w:hAnsi="Times New Roman"/>
+          <w:b w:val="0"/>
+          <w:color w:val="000000"/>
           <w:sz w:val="22"/>
         </w:rPr>
-        <w:t>13.6</w:t>
-        <w:tab/>
-        <w:t>Module 6.0: Attendance Ingestion &amp; Audit Service</w:t>
+        <w:t>• Module 1.0: Core Infrastructure &amp; Multi-Tenant Config Engine</w:t>
       </w:r>
       <w:r>
-        <w:rPr>
-          <w:rFonts w:ascii="Times New Roman" w:hAnsi="Times New Roman"/>
-          <w:sz w:val="22"/>
-        </w:rPr>
         <w:tab/>
       </w:r>
       <w:r>
         <w:rPr>
           <w:rFonts w:ascii="Times New Roman" w:hAnsi="Times New Roman"/>
+          <w:color w:val="000000"/>
+          <w:sz w:val="22"/>
+        </w:rPr>
+        <w:t>28</w:t>
+      </w:r>
+    </w:p>
+    <w:p>
+      <w:pPr>
+        <w:spacing w:before="40" w:after="40" w:lineRule="auto" w:line="276"/>
+        <w:ind w:left="576"/>
+        <w:tabs>
+          <w:tab w:val="right" w:leader="dot" w:pos="8668"/>
+        </w:tabs>
+      </w:pPr>
+      <w:r>
+        <w:rPr>
+          <w:rFonts w:ascii="Times New Roman" w:hAnsi="Times New Roman"/>
+          <w:b w:val="0"/>
+          <w:color w:val="000000"/>
+          <w:sz w:val="22"/>
+        </w:rPr>
+        <w:t>• Module 2.0: Identity, Access &amp; Role-Based Security (RBAC)</w:t>
+      </w:r>
+      <w:r>
+        <w:tab/>
+      </w:r>
+      <w:r>
+        <w:rPr>
+          <w:rFonts w:ascii="Times New Roman" w:hAnsi="Times New Roman"/>
+          <w:color w:val="000000"/>
+          <w:sz w:val="22"/>
+        </w:rPr>
+        <w:t>29</w:t>
+      </w:r>
+    </w:p>
+    <w:p>
+      <w:pPr>
+        <w:spacing w:before="40" w:after="40" w:lineRule="auto" w:line="276"/>
+        <w:ind w:left="576"/>
+        <w:tabs>
+          <w:tab w:val="right" w:leader="dot" w:pos="8668"/>
+        </w:tabs>
+      </w:pPr>
+      <w:r>
+        <w:rPr>
+          <w:rFonts w:ascii="Times New Roman" w:hAnsi="Times New Roman"/>
+          <w:b w:val="0"/>
+          <w:color w:val="000000"/>
+          <w:sz w:val="22"/>
+        </w:rPr>
+        <w:t>• Module 3.0: High-Speed Synthetic Data Engine</w:t>
+      </w:r>
+      <w:r>
+        <w:tab/>
+      </w:r>
+      <w:r>
+        <w:rPr>
+          <w:rFonts w:ascii="Times New Roman" w:hAnsi="Times New Roman"/>
+          <w:color w:val="000000"/>
           <w:sz w:val="22"/>
         </w:rPr>
         <w:t>30</w:t>
@@ -1968,63 +1805,28 @@
     </w:p>
     <w:p>
       <w:pPr>
+        <w:spacing w:before="40" w:after="40" w:lineRule="auto" w:line="276"/>
+        <w:ind w:left="576"/>
         <w:tabs>
-          <w:tab w:pos="8669" w:val="right" w:leader="dot"/>
+          <w:tab w:val="right" w:leader="dot" w:pos="8668"/>
         </w:tabs>
-        <w:spacing w:before="40" w:after="40" w:line="276" w:lineRule="auto"/>
-        <w:ind w:left="432"/>
       </w:pPr>
       <w:r>
         <w:rPr>
           <w:rFonts w:ascii="Times New Roman" w:hAnsi="Times New Roman"/>
+          <w:b w:val="0"/>
+          <w:color w:val="000000"/>
           <w:sz w:val="22"/>
         </w:rPr>
-        <w:t>13.7</w:t>
-        <w:tab/>
-        <w:t>Module 7.0: Fee Management &amp; Payment Ledger Module</w:t>
+        <w:t>• Module 4.0: Student &amp; Academic Management Module</w:t>
       </w:r>
       <w:r>
-        <w:rPr>
-          <w:rFonts w:ascii="Times New Roman" w:hAnsi="Times New Roman"/>
-          <w:sz w:val="22"/>
-        </w:rPr>
         <w:tab/>
       </w:r>
       <w:r>
         <w:rPr>
           <w:rFonts w:ascii="Times New Roman" w:hAnsi="Times New Roman"/>
-          <w:sz w:val="22"/>
-        </w:rPr>
-        <w:t>30</w:t>
-      </w:r>
-    </w:p>
-    <w:p>
-      <w:pPr>
-        <w:tabs>
-          <w:tab w:pos="8669" w:val="right" w:leader="dot"/>
-        </w:tabs>
-        <w:spacing w:before="40" w:after="40" w:line="276" w:lineRule="auto"/>
-        <w:ind w:left="432"/>
-      </w:pPr>
-      <w:r>
-        <w:rPr>
-          <w:rFonts w:ascii="Times New Roman" w:hAnsi="Times New Roman"/>
-          <w:sz w:val="22"/>
-        </w:rPr>
-        <w:t>13.8</w:t>
-        <w:tab/>
-        <w:t>Module 8.0: Parent Notification &amp; Communication Engine</w:t>
-      </w:r>
-      <w:r>
-        <w:rPr>
-          <w:rFonts w:ascii="Times New Roman" w:hAnsi="Times New Roman"/>
-          <w:sz w:val="22"/>
-        </w:rPr>
-        <w:tab/>
-      </w:r>
-      <w:r>
-        <w:rPr>
-          <w:rFonts w:ascii="Times New Roman" w:hAnsi="Times New Roman"/>
+          <w:color w:val="000000"/>
           <w:sz w:val="22"/>
         </w:rPr>
         <w:t>31</w:t>
@@ -2032,63 +1834,28 @@
     </w:p>
     <w:p>
       <w:pPr>
+        <w:spacing w:before="40" w:after="40" w:lineRule="auto" w:line="276"/>
+        <w:ind w:left="576"/>
         <w:tabs>
-          <w:tab w:pos="8669" w:val="right" w:leader="dot"/>
+          <w:tab w:val="right" w:leader="dot" w:pos="8668"/>
         </w:tabs>
-        <w:spacing w:before="40" w:after="40" w:line="276" w:lineRule="auto"/>
-        <w:ind w:left="432"/>
       </w:pPr>
       <w:r>
         <w:rPr>
           <w:rFonts w:ascii="Times New Roman" w:hAnsi="Times New Roman"/>
+          <w:b w:val="0"/>
+          <w:color w:val="000000"/>
           <w:sz w:val="22"/>
         </w:rPr>
-        <w:t>13.9</w:t>
-        <w:tab/>
-        <w:t>Module 9.0: Conversational Text-to-SQL Analytics Engine</w:t>
+        <w:t>• Module 5.0: YOLO Vision &amp; Register Digitization Engine (FLAGSHIP)</w:t>
       </w:r>
       <w:r>
-        <w:rPr>
-          <w:rFonts w:ascii="Times New Roman" w:hAnsi="Times New Roman"/>
-          <w:sz w:val="22"/>
-        </w:rPr>
         <w:tab/>
       </w:r>
       <w:r>
         <w:rPr>
           <w:rFonts w:ascii="Times New Roman" w:hAnsi="Times New Roman"/>
-          <w:sz w:val="22"/>
-        </w:rPr>
-        <w:t>31</w:t>
-      </w:r>
-    </w:p>
-    <w:p>
-      <w:pPr>
-        <w:tabs>
-          <w:tab w:pos="8669" w:val="right" w:leader="dot"/>
-        </w:tabs>
-        <w:spacing w:before="40" w:after="40" w:line="276" w:lineRule="auto"/>
-        <w:ind w:left="432"/>
-      </w:pPr>
-      <w:r>
-        <w:rPr>
-          <w:rFonts w:ascii="Times New Roman" w:hAnsi="Times New Roman"/>
-          <w:sz w:val="22"/>
-        </w:rPr>
-        <w:t>13.10</w:t>
-        <w:tab/>
-        <w:t>Module 10.0: Web Portal &amp; Mobile UI Interfaces</w:t>
-      </w:r>
-      <w:r>
-        <w:rPr>
-          <w:rFonts w:ascii="Times New Roman" w:hAnsi="Times New Roman"/>
-          <w:sz w:val="22"/>
-        </w:rPr>
-        <w:tab/>
-      </w:r>
-      <w:r>
-        <w:rPr>
-          <w:rFonts w:ascii="Times New Roman" w:hAnsi="Times New Roman"/>
+          <w:color w:val="000000"/>
           <w:sz w:val="22"/>
         </w:rPr>
         <w:t>32</w:t>
@@ -2096,65 +1863,231 @@
     </w:p>
     <w:p>
       <w:pPr>
+        <w:spacing w:before="40" w:after="40" w:lineRule="auto" w:line="276"/>
+        <w:ind w:left="576"/>
         <w:tabs>
-          <w:tab w:pos="8669" w:val="right" w:leader="dot"/>
+          <w:tab w:val="right" w:leader="dot" w:pos="8668"/>
         </w:tabs>
-        <w:spacing w:before="40" w:after="40" w:line="276" w:lineRule="auto"/>
+      </w:pPr>
+      <w:r>
+        <w:rPr>
+          <w:rFonts w:ascii="Times New Roman" w:hAnsi="Times New Roman"/>
+          <w:b w:val="0"/>
+          <w:color w:val="000000"/>
+          <w:sz w:val="22"/>
+        </w:rPr>
+        <w:t>• Module 6.0: Attendance Ingestion &amp; Audit Service</w:t>
+      </w:r>
+      <w:r>
+        <w:tab/>
+      </w:r>
+      <w:r>
+        <w:rPr>
+          <w:rFonts w:ascii="Times New Roman" w:hAnsi="Times New Roman"/>
+          <w:color w:val="000000"/>
+          <w:sz w:val="22"/>
+        </w:rPr>
+        <w:t>34</w:t>
+      </w:r>
+    </w:p>
+    <w:p>
+      <w:pPr>
+        <w:spacing w:before="40" w:after="40" w:lineRule="auto" w:line="276"/>
+        <w:ind w:left="576"/>
+        <w:tabs>
+          <w:tab w:val="right" w:leader="dot" w:pos="8668"/>
+        </w:tabs>
+      </w:pPr>
+      <w:r>
+        <w:rPr>
+          <w:rFonts w:ascii="Times New Roman" w:hAnsi="Times New Roman"/>
+          <w:b w:val="0"/>
+          <w:color w:val="000000"/>
+          <w:sz w:val="22"/>
+        </w:rPr>
+        <w:t>• Module 7.0: Fee Management &amp; Payment Ledger Module</w:t>
+      </w:r>
+      <w:r>
+        <w:tab/>
+      </w:r>
+      <w:r>
+        <w:rPr>
+          <w:rFonts w:ascii="Times New Roman" w:hAnsi="Times New Roman"/>
+          <w:color w:val="000000"/>
+          <w:sz w:val="22"/>
+        </w:rPr>
+        <w:t>34</w:t>
+      </w:r>
+    </w:p>
+    <w:p>
+      <w:pPr>
+        <w:spacing w:before="40" w:after="40" w:lineRule="auto" w:line="276"/>
+        <w:ind w:left="576"/>
+        <w:tabs>
+          <w:tab w:val="right" w:leader="dot" w:pos="8668"/>
+        </w:tabs>
+      </w:pPr>
+      <w:r>
+        <w:rPr>
+          <w:rFonts w:ascii="Times New Roman" w:hAnsi="Times New Roman"/>
+          <w:b w:val="0"/>
+          <w:color w:val="000000"/>
+          <w:sz w:val="22"/>
+        </w:rPr>
+        <w:t>• Module 8.0: Parent Notification &amp; Communication Engine</w:t>
+      </w:r>
+      <w:r>
+        <w:tab/>
+      </w:r>
+      <w:r>
+        <w:rPr>
+          <w:rFonts w:ascii="Times New Roman" w:hAnsi="Times New Roman"/>
+          <w:color w:val="000000"/>
+          <w:sz w:val="22"/>
+        </w:rPr>
+        <w:t>35</w:t>
+      </w:r>
+    </w:p>
+    <w:p>
+      <w:pPr>
+        <w:spacing w:before="40" w:after="40" w:lineRule="auto" w:line="276"/>
+        <w:ind w:left="576"/>
+        <w:tabs>
+          <w:tab w:val="right" w:leader="dot" w:pos="8668"/>
+        </w:tabs>
+      </w:pPr>
+      <w:r>
+        <w:rPr>
+          <w:rFonts w:ascii="Times New Roman" w:hAnsi="Times New Roman"/>
+          <w:b w:val="0"/>
+          <w:color w:val="000000"/>
+          <w:sz w:val="22"/>
+        </w:rPr>
+        <w:t>• Module 9.0: Conversational Text-to-SQL Analytics Engine</w:t>
+      </w:r>
+      <w:r>
+        <w:tab/>
+      </w:r>
+      <w:r>
+        <w:rPr>
+          <w:rFonts w:ascii="Times New Roman" w:hAnsi="Times New Roman"/>
+          <w:color w:val="000000"/>
+          <w:sz w:val="22"/>
+        </w:rPr>
+        <w:t>35</w:t>
+      </w:r>
+    </w:p>
+    <w:p>
+      <w:pPr>
+        <w:spacing w:before="40" w:after="40" w:lineRule="auto" w:line="276"/>
+        <w:ind w:left="576"/>
+        <w:tabs>
+          <w:tab w:val="right" w:leader="dot" w:pos="8668"/>
+        </w:tabs>
+      </w:pPr>
+      <w:r>
+        <w:rPr>
+          <w:rFonts w:ascii="Times New Roman" w:hAnsi="Times New Roman"/>
+          <w:b w:val="0"/>
+          <w:color w:val="000000"/>
+          <w:sz w:val="22"/>
+        </w:rPr>
+        <w:t>• Module 10.0: Web Portal &amp; Mobile UI Interfaces</w:t>
+      </w:r>
+      <w:r>
+        <w:tab/>
+      </w:r>
+      <w:r>
+        <w:rPr>
+          <w:rFonts w:ascii="Times New Roman" w:hAnsi="Times New Roman"/>
+          <w:color w:val="000000"/>
+          <w:sz w:val="22"/>
+        </w:rPr>
+        <w:t>36</w:t>
+      </w:r>
+    </w:p>
+    <w:p>
+      <w:pPr>
+        <w:spacing w:before="40" w:after="40" w:lineRule="auto" w:line="276"/>
+        <w:tabs>
+          <w:tab w:val="right" w:leader="dot" w:pos="8668"/>
+        </w:tabs>
       </w:pPr>
       <w:r>
         <w:rPr>
           <w:rFonts w:ascii="Times New Roman" w:hAnsi="Times New Roman"/>
           <w:b/>
+          <w:color w:val="000000"/>
           <w:sz w:val="22"/>
         </w:rPr>
-        <w:t>14</w:t>
-        <w:tab/>
-        <w:t>Chapter 10: System Design &amp; Flow Diagrams</w:t>
+        <w:t>14. System Design &amp; Flow Diagrams</w:t>
       </w:r>
       <w:r>
-        <w:rPr>
-          <w:rFonts w:ascii="Times New Roman" w:hAnsi="Times New Roman"/>
-          <w:sz w:val="22"/>
-        </w:rPr>
         <w:tab/>
       </w:r>
       <w:r>
         <w:rPr>
           <w:rFonts w:ascii="Times New Roman" w:hAnsi="Times New Roman"/>
           <w:b/>
+          <w:color w:val="000000"/>
           <w:sz w:val="22"/>
         </w:rPr>
-        <w:t>33</w:t>
+        <w:t>37</w:t>
       </w:r>
     </w:p>
     <w:p>
       <w:pPr>
+        <w:spacing w:before="40" w:after="40" w:lineRule="auto" w:line="276"/>
+        <w:ind w:left="576"/>
         <w:tabs>
-          <w:tab w:pos="8669" w:val="right" w:leader="dot"/>
+          <w:tab w:val="right" w:leader="dot" w:pos="8668"/>
         </w:tabs>
-        <w:spacing w:before="40" w:after="40" w:line="276" w:lineRule="auto"/>
       </w:pPr>
       <w:r>
         <w:rPr>
           <w:rFonts w:ascii="Times New Roman" w:hAnsi="Times New Roman"/>
-          <w:b/>
+          <w:b w:val="0"/>
+          <w:color w:val="000000"/>
           <w:sz w:val="22"/>
         </w:rPr>
-        <w:t>15</w:t>
-        <w:tab/>
-        <w:t>Chapter 11: Data Tables — Complete Data Dictionary</w:t>
+        <w:t>(i) Computer Vision &amp; YOLO Inference Pipeline Flowchart</w:t>
       </w:r>
       <w:r>
-        <w:rPr>
-          <w:rFonts w:ascii="Times New Roman" w:hAnsi="Times New Roman"/>
-          <w:sz w:val="22"/>
-        </w:rPr>
         <w:tab/>
       </w:r>
       <w:r>
         <w:rPr>
           <w:rFonts w:ascii="Times New Roman" w:hAnsi="Times New Roman"/>
-          <w:b/>
+          <w:color w:val="000000"/>
+          <w:sz w:val="22"/>
+        </w:rPr>
+        <w:t>37</w:t>
+      </w:r>
+    </w:p>
+    <w:p>
+      <w:pPr>
+        <w:spacing w:before="40" w:after="40" w:lineRule="auto" w:line="276"/>
+        <w:ind w:left="576"/>
+        <w:tabs>
+          <w:tab w:val="right" w:leader="dot" w:pos="8668"/>
+        </w:tabs>
+      </w:pPr>
+      <w:r>
+        <w:rPr>
+          <w:rFonts w:ascii="Times New Roman" w:hAnsi="Times New Roman"/>
+          <w:b w:val="0"/>
+          <w:color w:val="000000"/>
+          <w:sz w:val="22"/>
+        </w:rPr>
+        <w:t>(ii) Context-Level (0-Level) Data Flow Diagram</w:t>
+      </w:r>
+      <w:r>
+        <w:tab/>
+      </w:r>
+      <w:r>
+        <w:rPr>
+          <w:rFonts w:ascii="Times New Roman" w:hAnsi="Times New Roman"/>
+          <w:color w:val="000000"/>
           <w:sz w:val="22"/>
         </w:rPr>
         <w:t>38</w:t>
@@ -2162,101 +2095,205 @@
     </w:p>
     <w:p>
       <w:pPr>
+        <w:spacing w:before="40" w:after="40" w:lineRule="auto" w:line="276"/>
+        <w:ind w:left="576"/>
         <w:tabs>
-          <w:tab w:pos="8669" w:val="right" w:leader="dot"/>
+          <w:tab w:val="right" w:leader="dot" w:pos="8668"/>
         </w:tabs>
-        <w:spacing w:before="40" w:after="40" w:line="276" w:lineRule="auto"/>
+      </w:pPr>
+      <w:r>
+        <w:rPr>
+          <w:rFonts w:ascii="Times New Roman" w:hAnsi="Times New Roman"/>
+          <w:b w:val="0"/>
+          <w:color w:val="000000"/>
+          <w:sz w:val="22"/>
+        </w:rPr>
+        <w:t>(iii) Level-1 Decomposed Data Flow Diagram</w:t>
+      </w:r>
+      <w:r>
+        <w:tab/>
+      </w:r>
+      <w:r>
+        <w:rPr>
+          <w:rFonts w:ascii="Times New Roman" w:hAnsi="Times New Roman"/>
+          <w:color w:val="000000"/>
+          <w:sz w:val="22"/>
+        </w:rPr>
+        <w:t>39</w:t>
+      </w:r>
+    </w:p>
+    <w:p>
+      <w:pPr>
+        <w:spacing w:before="40" w:after="40" w:lineRule="auto" w:line="276"/>
+        <w:ind w:left="576"/>
+        <w:tabs>
+          <w:tab w:val="right" w:leader="dot" w:pos="8668"/>
+        </w:tabs>
+      </w:pPr>
+      <w:r>
+        <w:rPr>
+          <w:rFonts w:ascii="Times New Roman" w:hAnsi="Times New Roman"/>
+          <w:b w:val="0"/>
+          <w:color w:val="000000"/>
+          <w:sz w:val="22"/>
+        </w:rPr>
+        <w:t>(iv) Entity-Relationship (ER) Diagram — 3NF Relational Schema</w:t>
+      </w:r>
+      <w:r>
+        <w:tab/>
+      </w:r>
+      <w:r>
+        <w:rPr>
+          <w:rFonts w:ascii="Times New Roman" w:hAnsi="Times New Roman"/>
+          <w:color w:val="000000"/>
+          <w:sz w:val="22"/>
+        </w:rPr>
+        <w:t>40</w:t>
+      </w:r>
+    </w:p>
+    <w:p>
+      <w:pPr>
+        <w:spacing w:before="40" w:after="40" w:lineRule="auto" w:line="276"/>
+        <w:tabs>
+          <w:tab w:val="right" w:leader="dot" w:pos="8668"/>
+        </w:tabs>
       </w:pPr>
       <w:r>
         <w:rPr>
           <w:rFonts w:ascii="Times New Roman" w:hAnsi="Times New Roman"/>
           <w:b/>
+          <w:color w:val="000000"/>
           <w:sz w:val="22"/>
         </w:rPr>
-        <w:t>16</w:t>
-        <w:tab/>
-        <w:t>Chapter 12: Future Scope</w:t>
+        <w:t>15. Data Tables — Complete Data Dictionary</w:t>
       </w:r>
       <w:r>
-        <w:rPr>
-          <w:rFonts w:ascii="Times New Roman" w:hAnsi="Times New Roman"/>
-          <w:sz w:val="22"/>
-        </w:rPr>
         <w:tab/>
       </w:r>
       <w:r>
         <w:rPr>
           <w:rFonts w:ascii="Times New Roman" w:hAnsi="Times New Roman"/>
           <w:b/>
+          <w:color w:val="000000"/>
           <w:sz w:val="22"/>
         </w:rPr>
-        <w:t>46</w:t>
+        <w:t>41</w:t>
       </w:r>
     </w:p>
     <w:p>
       <w:pPr>
+        <w:spacing w:before="40" w:after="40" w:lineRule="auto" w:line="276"/>
         <w:tabs>
-          <w:tab w:pos="8669" w:val="right" w:leader="dot"/>
+          <w:tab w:val="right" w:leader="dot" w:pos="8668"/>
         </w:tabs>
-        <w:spacing w:before="40" w:after="40" w:line="276" w:lineRule="auto"/>
       </w:pPr>
       <w:r>
         <w:rPr>
           <w:rFonts w:ascii="Times New Roman" w:hAnsi="Times New Roman"/>
           <w:b/>
+          <w:color w:val="000000"/>
           <w:sz w:val="22"/>
         </w:rPr>
-        <w:t>17</w:t>
-        <w:tab/>
-        <w:t>Chapter 13: Conclusion</w:t>
+        <w:t>16. Results &amp; Performance Benchmarks</w:t>
       </w:r>
       <w:r>
-        <w:rPr>
-          <w:rFonts w:ascii="Times New Roman" w:hAnsi="Times New Roman"/>
-          <w:sz w:val="22"/>
-        </w:rPr>
         <w:tab/>
       </w:r>
       <w:r>
         <w:rPr>
           <w:rFonts w:ascii="Times New Roman" w:hAnsi="Times New Roman"/>
           <w:b/>
+          <w:color w:val="000000"/>
           <w:sz w:val="22"/>
         </w:rPr>
-        <w:t>48</w:t>
+        <w:t>50</w:t>
       </w:r>
     </w:p>
     <w:p>
       <w:pPr>
+        <w:spacing w:before="40" w:after="40" w:lineRule="auto" w:line="276"/>
         <w:tabs>
-          <w:tab w:pos="8669" w:val="right" w:leader="dot"/>
+          <w:tab w:val="right" w:leader="dot" w:pos="8668"/>
         </w:tabs>
-        <w:spacing w:before="40" w:after="40" w:line="276" w:lineRule="auto"/>
       </w:pPr>
       <w:r>
         <w:rPr>
           <w:rFonts w:ascii="Times New Roman" w:hAnsi="Times New Roman"/>
           <w:b/>
+          <w:color w:val="000000"/>
           <w:sz w:val="22"/>
         </w:rPr>
-        <w:t>18</w:t>
-        <w:tab/>
-        <w:t>Chapter 14: Bibliography / References</w:t>
+        <w:t>17. Future Scope</w:t>
       </w:r>
       <w:r>
-        <w:rPr>
-          <w:rFonts w:ascii="Times New Roman" w:hAnsi="Times New Roman"/>
-          <w:sz w:val="22"/>
-        </w:rPr>
         <w:tab/>
       </w:r>
       <w:r>
         <w:rPr>
           <w:rFonts w:ascii="Times New Roman" w:hAnsi="Times New Roman"/>
           <w:b/>
+          <w:color w:val="000000"/>
           <w:sz w:val="22"/>
         </w:rPr>
-        <w:t>49</w:t>
+        <w:t>52</w:t>
+      </w:r>
+    </w:p>
+    <w:p>
+      <w:pPr>
+        <w:spacing w:before="40" w:after="40" w:lineRule="auto" w:line="276"/>
+        <w:tabs>
+          <w:tab w:val="right" w:leader="dot" w:pos="8668"/>
+        </w:tabs>
+      </w:pPr>
+      <w:r>
+        <w:rPr>
+          <w:rFonts w:ascii="Times New Roman" w:hAnsi="Times New Roman"/>
+          <w:b/>
+          <w:color w:val="000000"/>
+          <w:sz w:val="22"/>
+        </w:rPr>
+        <w:t>18. Conclusion</w:t>
+      </w:r>
+      <w:r>
+        <w:tab/>
+      </w:r>
+      <w:r>
+        <w:rPr>
+          <w:rFonts w:ascii="Times New Roman" w:hAnsi="Times New Roman"/>
+          <w:b/>
+          <w:color w:val="000000"/>
+          <w:sz w:val="22"/>
+        </w:rPr>
+        <w:t>55</w:t>
+      </w:r>
+    </w:p>
+    <w:p>
+      <w:pPr>
+        <w:spacing w:before="40" w:after="40" w:lineRule="auto" w:line="276"/>
+        <w:tabs>
+          <w:tab w:val="right" w:leader="dot" w:pos="8668"/>
+        </w:tabs>
+      </w:pPr>
+      <w:r>
+        <w:rPr>
+          <w:rFonts w:ascii="Times New Roman" w:hAnsi="Times New Roman"/>
+          <w:b/>
+          <w:color w:val="000000"/>
+          <w:sz w:val="22"/>
+        </w:rPr>
+        <w:t>19. Bibliography / References</w:t>
+      </w:r>
+      <w:r>
+        <w:tab/>
+      </w:r>
+      <w:r>
+        <w:rPr>
+          <w:rFonts w:ascii="Times New Roman" w:hAnsi="Times New Roman"/>
+          <w:b/>
+          <w:color w:val="000000"/>
+          <w:sz w:val="22"/>
+        </w:rPr>
+        <w:t>57</w:t>
       </w:r>
     </w:p>
     <w:p/>
@@ -2277,123 +2314,28 @@
     </w:p>
     <w:p>
       <w:pPr>
+        <w:spacing w:before="40" w:after="40" w:lineRule="auto" w:line="276"/>
+        <w:ind w:left="576"/>
         <w:tabs>
-          <w:tab w:pos="8669" w:val="right" w:leader="dot"/>
+          <w:tab w:val="right" w:leader="dot" w:pos="8668"/>
         </w:tabs>
-        <w:spacing w:before="40" w:after="40" w:line="276" w:lineRule="auto"/>
       </w:pPr>
       <w:r>
         <w:rPr>
           <w:rFonts w:ascii="Times New Roman" w:hAnsi="Times New Roman"/>
+          <w:b w:val="0"/>
+          <w:color w:val="000000"/>
           <w:sz w:val="22"/>
         </w:rPr>
-        <w:t>Fig. 1</w:t>
-        <w:tab/>
-        <w:t>YOLO Vision &amp; Register Digitization Pipeline Flowchart</w:t>
+        <w:t>Fig. 1 YOLO Vision &amp; Register Digitization Pipeline Flowchart</w:t>
       </w:r>
       <w:r>
-        <w:rPr>
-          <w:rFonts w:ascii="Times New Roman" w:hAnsi="Times New Roman"/>
-          <w:sz w:val="22"/>
-        </w:rPr>
         <w:tab/>
       </w:r>
       <w:r>
         <w:rPr>
           <w:rFonts w:ascii="Times New Roman" w:hAnsi="Times New Roman"/>
-          <w:sz w:val="22"/>
-        </w:rPr>
-        <w:t>34</w:t>
-      </w:r>
-    </w:p>
-    <w:p>
-      <w:pPr>
-        <w:tabs>
-          <w:tab w:pos="8669" w:val="right" w:leader="dot"/>
-        </w:tabs>
-        <w:spacing w:before="40" w:after="40" w:line="276" w:lineRule="auto"/>
-      </w:pPr>
-      <w:r>
-        <w:rPr>
-          <w:rFonts w:ascii="Times New Roman" w:hAnsi="Times New Roman"/>
-          <w:sz w:val="22"/>
-        </w:rPr>
-        <w:t>Fig. 2</w:t>
-        <w:tab/>
-        <w:t>Context-Level (0-Level) Data Flow Diagram</w:t>
-      </w:r>
-      <w:r>
-        <w:rPr>
-          <w:rFonts w:ascii="Times New Roman" w:hAnsi="Times New Roman"/>
-          <w:sz w:val="22"/>
-        </w:rPr>
-        <w:tab/>
-      </w:r>
-      <w:r>
-        <w:rPr>
-          <w:rFonts w:ascii="Times New Roman" w:hAnsi="Times New Roman"/>
-          <w:sz w:val="22"/>
-        </w:rPr>
-        <w:t>35</w:t>
-      </w:r>
-    </w:p>
-    <w:p>
-      <w:pPr>
-        <w:tabs>
-          <w:tab w:pos="8669" w:val="right" w:leader="dot"/>
-        </w:tabs>
-        <w:spacing w:before="40" w:after="40" w:line="276" w:lineRule="auto"/>
-      </w:pPr>
-      <w:r>
-        <w:rPr>
-          <w:rFonts w:ascii="Times New Roman" w:hAnsi="Times New Roman"/>
-          <w:sz w:val="22"/>
-        </w:rPr>
-        <w:t>Fig. 3</w:t>
-        <w:tab/>
-        <w:t>Level-1 Decomposed Data Flow Diagram</w:t>
-      </w:r>
-      <w:r>
-        <w:rPr>
-          <w:rFonts w:ascii="Times New Roman" w:hAnsi="Times New Roman"/>
-          <w:sz w:val="22"/>
-        </w:rPr>
-        <w:tab/>
-      </w:r>
-      <w:r>
-        <w:rPr>
-          <w:rFonts w:ascii="Times New Roman" w:hAnsi="Times New Roman"/>
-          <w:sz w:val="22"/>
-        </w:rPr>
-        <w:t>36</w:t>
-      </w:r>
-    </w:p>
-    <w:p>
-      <w:pPr>
-        <w:tabs>
-          <w:tab w:pos="8669" w:val="right" w:leader="dot"/>
-        </w:tabs>
-        <w:spacing w:before="40" w:after="40" w:line="276" w:lineRule="auto"/>
-      </w:pPr>
-      <w:r>
-        <w:rPr>
-          <w:rFonts w:ascii="Times New Roman" w:hAnsi="Times New Roman"/>
-          <w:sz w:val="22"/>
-        </w:rPr>
-        <w:t>Fig. 4</w:t>
-        <w:tab/>
-        <w:t>Entity-Relationship (ER) Diagram — 3NF Schema</w:t>
-      </w:r>
-      <w:r>
-        <w:rPr>
-          <w:rFonts w:ascii="Times New Roman" w:hAnsi="Times New Roman"/>
-          <w:sz w:val="22"/>
-        </w:rPr>
-        <w:tab/>
-      </w:r>
-      <w:r>
-        <w:rPr>
-          <w:rFonts w:ascii="Times New Roman" w:hAnsi="Times New Roman"/>
+          <w:color w:val="000000"/>
           <w:sz w:val="22"/>
         </w:rPr>
         <w:t>37</w:t>
@@ -2401,95 +2343,176 @@
     </w:p>
     <w:p>
       <w:pPr>
+        <w:spacing w:before="40" w:after="40" w:lineRule="auto" w:line="276"/>
+        <w:ind w:left="576"/>
         <w:tabs>
-          <w:tab w:pos="8669" w:val="right" w:leader="dot"/>
+          <w:tab w:val="right" w:leader="dot" w:pos="8668"/>
         </w:tabs>
-        <w:spacing w:before="40" w:after="40" w:line="276" w:lineRule="auto"/>
       </w:pPr>
       <w:r>
         <w:rPr>
           <w:rFonts w:ascii="Times New Roman" w:hAnsi="Times New Roman"/>
+          <w:b w:val="0"/>
+          <w:color w:val="000000"/>
           <w:sz w:val="22"/>
         </w:rPr>
-        <w:t>Fig. 5</w:t>
-        <w:tab/>
-        <w:t>System Architecture — Multi-Tier Hybrid Deployment</w:t>
+        <w:t>Fig. 2 Context-Level (0-Level) Data Flow Diagram</w:t>
       </w:r>
       <w:r>
-        <w:rPr>
-          <w:rFonts w:ascii="Times New Roman" w:hAnsi="Times New Roman"/>
-          <w:sz w:val="22"/>
-        </w:rPr>
         <w:tab/>
       </w:r>
       <w:r>
         <w:rPr>
           <w:rFonts w:ascii="Times New Roman" w:hAnsi="Times New Roman"/>
+          <w:color w:val="000000"/>
           <w:sz w:val="22"/>
         </w:rPr>
-        <w:t>25</w:t>
+        <w:t>38</w:t>
       </w:r>
     </w:p>
     <w:p>
       <w:pPr>
+        <w:spacing w:before="40" w:after="40" w:lineRule="auto" w:line="276"/>
+        <w:ind w:left="576"/>
         <w:tabs>
-          <w:tab w:pos="8669" w:val="right" w:leader="dot"/>
+          <w:tab w:val="right" w:leader="dot" w:pos="8668"/>
         </w:tabs>
-        <w:spacing w:before="40" w:after="40" w:line="276" w:lineRule="auto"/>
       </w:pPr>
       <w:r>
         <w:rPr>
           <w:rFonts w:ascii="Times New Roman" w:hAnsi="Times New Roman"/>
+          <w:b w:val="0"/>
+          <w:color w:val="000000"/>
           <w:sz w:val="22"/>
         </w:rPr>
-        <w:t>Fig. 6</w:t>
-        <w:tab/>
-        <w:t>RBAC Role Hierarchy Diagram</w:t>
+        <w:t>Fig. 3 Level-1 Decomposed Data Flow Diagram</w:t>
       </w:r>
       <w:r>
-        <w:rPr>
-          <w:rFonts w:ascii="Times New Roman" w:hAnsi="Times New Roman"/>
-          <w:sz w:val="22"/>
-        </w:rPr>
         <w:tab/>
       </w:r>
       <w:r>
         <w:rPr>
           <w:rFonts w:ascii="Times New Roman" w:hAnsi="Times New Roman"/>
+          <w:color w:val="000000"/>
           <w:sz w:val="22"/>
         </w:rPr>
-        <w:t>26</w:t>
+        <w:t>39</w:t>
       </w:r>
     </w:p>
     <w:p>
       <w:pPr>
+        <w:spacing w:before="40" w:after="40" w:lineRule="auto" w:line="276"/>
+        <w:ind w:left="576"/>
         <w:tabs>
-          <w:tab w:pos="8669" w:val="right" w:leader="dot"/>
+          <w:tab w:val="right" w:leader="dot" w:pos="8668"/>
         </w:tabs>
-        <w:spacing w:before="40" w:after="40" w:line="276" w:lineRule="auto"/>
       </w:pPr>
       <w:r>
         <w:rPr>
           <w:rFonts w:ascii="Times New Roman" w:hAnsi="Times New Roman"/>
+          <w:b w:val="0"/>
+          <w:color w:val="000000"/>
           <w:sz w:val="22"/>
         </w:rPr>
-        <w:t>Fig. 7</w:t>
-        <w:tab/>
-        <w:t>Text-to-SQL AST Guardrails Processing Flow</w:t>
+        <w:t>Fig. 4 Entity-Relationship (ER) Diagram — 3NF Schema</w:t>
       </w:r>
       <w:r>
-        <w:rPr>
-          <w:rFonts w:ascii="Times New Roman" w:hAnsi="Times New Roman"/>
-          <w:sz w:val="22"/>
-        </w:rPr>
         <w:tab/>
       </w:r>
       <w:r>
         <w:rPr>
           <w:rFonts w:ascii="Times New Roman" w:hAnsi="Times New Roman"/>
+          <w:color w:val="000000"/>
           <w:sz w:val="22"/>
         </w:rPr>
-        <w:t>32</w:t>
+        <w:t>40</w:t>
+      </w:r>
+    </w:p>
+    <w:p>
+      <w:pPr>
+        <w:spacing w:before="40" w:after="40" w:lineRule="auto" w:line="276"/>
+        <w:ind w:left="576"/>
+        <w:tabs>
+          <w:tab w:val="right" w:leader="dot" w:pos="8668"/>
+        </w:tabs>
+      </w:pPr>
+      <w:r>
+        <w:rPr>
+          <w:rFonts w:ascii="Times New Roman" w:hAnsi="Times New Roman"/>
+          <w:b w:val="0"/>
+          <w:color w:val="000000"/>
+          <w:sz w:val="22"/>
+        </w:rPr>
+        <w:t>Fig. 5 System Architecture — Multi-Tier Hybrid Deployment</w:t>
+      </w:r>
+      <w:r>
+        <w:tab/>
+      </w:r>
+      <w:r>
+        <w:rPr>
+          <w:rFonts w:ascii="Times New Roman" w:hAnsi="Times New Roman"/>
+          <w:color w:val="000000"/>
+          <w:sz w:val="22"/>
+        </w:rPr>
+        <w:t>28</w:t>
+      </w:r>
+    </w:p>
+    <w:p>
+      <w:pPr>
+        <w:spacing w:before="40" w:after="40" w:lineRule="auto" w:line="276"/>
+        <w:ind w:left="576"/>
+        <w:tabs>
+          <w:tab w:val="right" w:leader="dot" w:pos="8668"/>
+        </w:tabs>
+      </w:pPr>
+      <w:r>
+        <w:rPr>
+          <w:rFonts w:ascii="Times New Roman" w:hAnsi="Times New Roman"/>
+          <w:b w:val="0"/>
+          <w:color w:val="000000"/>
+          <w:sz w:val="22"/>
+        </w:rPr>
+        <w:t>Fig. 6 RBAC Role Hierarchy Diagram</w:t>
+      </w:r>
+      <w:r>
+        <w:tab/>
+      </w:r>
+      <w:r>
+        <w:rPr>
+          <w:rFonts w:ascii="Times New Roman" w:hAnsi="Times New Roman"/>
+          <w:color w:val="000000"/>
+          <w:sz w:val="22"/>
+        </w:rPr>
+        <w:t>29</w:t>
+      </w:r>
+    </w:p>
+    <w:p>
+      <w:pPr>
+        <w:spacing w:before="40" w:after="40" w:lineRule="auto" w:line="276"/>
+        <w:ind w:left="576"/>
+        <w:tabs>
+          <w:tab w:val="right" w:leader="dot" w:pos="8668"/>
+        </w:tabs>
+      </w:pPr>
+      <w:r>
+        <w:rPr>
+          <w:rFonts w:ascii="Times New Roman" w:hAnsi="Times New Roman"/>
+          <w:b w:val="0"/>
+          <w:color w:val="000000"/>
+          <w:sz w:val="22"/>
+        </w:rPr>
+        <w:t>Fig. 7 Text-to-SQL AST Guardrails Processing Flow</w:t>
+      </w:r>
+      <w:r>
+        <w:tab/>
+      </w:r>
+      <w:r>
+        <w:rPr>
+          <w:rFonts w:ascii="Times New Roman" w:hAnsi="Times New Roman"/>
+          <w:color w:val="000000"/>
+          <w:sz w:val="22"/>
+        </w:rPr>
+        <w:t>35</w:t>
       </w:r>
     </w:p>
     <w:p/>
@@ -2510,185 +2533,144 @@
     </w:p>
     <w:p>
       <w:pPr>
+        <w:spacing w:before="40" w:after="40" w:lineRule="auto" w:line="276"/>
+        <w:ind w:left="576"/>
         <w:tabs>
-          <w:tab w:pos="8669" w:val="right" w:leader="dot"/>
+          <w:tab w:val="right" w:leader="dot" w:pos="8668"/>
         </w:tabs>
-        <w:spacing w:before="40" w:after="40" w:line="276" w:lineRule="auto"/>
       </w:pPr>
       <w:r>
         <w:rPr>
           <w:rFonts w:ascii="Times New Roman" w:hAnsi="Times New Roman"/>
+          <w:b w:val="0"/>
+          <w:color w:val="000000"/>
           <w:sz w:val="22"/>
         </w:rPr>
-        <w:t>Table 1</w:t>
-        <w:tab/>
-        <w:t>Comparative Analysis: HAAZIR vs. Commercial ERP Platforms</w:t>
+        <w:t>Table 1 Comparative Analysis: HAAZIR vs. Commercial ERP Platforms</w:t>
       </w:r>
       <w:r>
-        <w:rPr>
-          <w:rFonts w:ascii="Times New Roman" w:hAnsi="Times New Roman"/>
-          <w:sz w:val="22"/>
-        </w:rPr>
         <w:tab/>
       </w:r>
       <w:r>
         <w:rPr>
           <w:rFonts w:ascii="Times New Roman" w:hAnsi="Times New Roman"/>
+          <w:color w:val="000000"/>
           <w:sz w:val="22"/>
         </w:rPr>
-        <w:t>9</w:t>
+        <w:t>10</w:t>
       </w:r>
     </w:p>
     <w:p>
       <w:pPr>
+        <w:spacing w:before="40" w:after="40" w:lineRule="auto" w:line="276"/>
+        <w:ind w:left="576"/>
         <w:tabs>
-          <w:tab w:pos="8669" w:val="right" w:leader="dot"/>
+          <w:tab w:val="right" w:leader="dot" w:pos="8668"/>
         </w:tabs>
-        <w:spacing w:before="40" w:after="40" w:line="276" w:lineRule="auto"/>
       </w:pPr>
       <w:r>
         <w:rPr>
           <w:rFonts w:ascii="Times New Roman" w:hAnsi="Times New Roman"/>
+          <w:b w:val="0"/>
+          <w:color w:val="000000"/>
           <w:sz w:val="22"/>
         </w:rPr>
-        <w:t>Table 2</w:t>
-        <w:tab/>
-        <w:t>Beneficiary Stakeholder Analysis Matrix</w:t>
+        <w:t>Table 2 Beneficiary Stakeholder Analysis Matrix</w:t>
       </w:r>
       <w:r>
-        <w:rPr>
-          <w:rFonts w:ascii="Times New Roman" w:hAnsi="Times New Roman"/>
-          <w:sz w:val="22"/>
-        </w:rPr>
         <w:tab/>
       </w:r>
       <w:r>
         <w:rPr>
           <w:rFonts w:ascii="Times New Roman" w:hAnsi="Times New Roman"/>
+          <w:color w:val="000000"/>
           <w:sz w:val="22"/>
         </w:rPr>
-        <w:t>11</w:t>
+        <w:t>12</w:t>
       </w:r>
     </w:p>
     <w:p>
       <w:pPr>
+        <w:spacing w:before="40" w:after="40" w:lineRule="auto" w:line="276"/>
+        <w:ind w:left="576"/>
         <w:tabs>
-          <w:tab w:pos="8669" w:val="right" w:leader="dot"/>
+          <w:tab w:val="right" w:leader="dot" w:pos="8668"/>
         </w:tabs>
-        <w:spacing w:before="40" w:after="40" w:line="276" w:lineRule="auto"/>
       </w:pPr>
       <w:r>
         <w:rPr>
           <w:rFonts w:ascii="Times New Roman" w:hAnsi="Times New Roman"/>
+          <w:b w:val="0"/>
+          <w:color w:val="000000"/>
           <w:sz w:val="22"/>
         </w:rPr>
-        <w:t>Table 3</w:t>
-        <w:tab/>
-        <w:t>Feasibility Assessment Summary</w:t>
+        <w:t>Table 3 Feasibility Assessment Summary</w:t>
       </w:r>
       <w:r>
-        <w:rPr>
-          <w:rFonts w:ascii="Times New Roman" w:hAnsi="Times New Roman"/>
-          <w:sz w:val="22"/>
-        </w:rPr>
         <w:tab/>
       </w:r>
       <w:r>
         <w:rPr>
           <w:rFonts w:ascii="Times New Roman" w:hAnsi="Times New Roman"/>
+          <w:color w:val="000000"/>
           <w:sz w:val="22"/>
         </w:rPr>
-        <w:t>14</w:t>
+        <w:t>15</w:t>
       </w:r>
     </w:p>
     <w:p>
       <w:pPr>
+        <w:spacing w:before="40" w:after="40" w:lineRule="auto" w:line="276"/>
+        <w:ind w:left="576"/>
         <w:tabs>
-          <w:tab w:pos="8669" w:val="right" w:leader="dot"/>
+          <w:tab w:val="right" w:leader="dot" w:pos="8668"/>
         </w:tabs>
-        <w:spacing w:before="40" w:after="40" w:line="276" w:lineRule="auto"/>
       </w:pPr>
       <w:r>
         <w:rPr>
           <w:rFonts w:ascii="Times New Roman" w:hAnsi="Times New Roman"/>
+          <w:b w:val="0"/>
+          <w:color w:val="000000"/>
           <w:sz w:val="22"/>
         </w:rPr>
-        <w:t>Table 4</w:t>
-        <w:tab/>
-        <w:t>Sprint-Wise Project Schedule (Gantt Summary)</w:t>
+        <w:t>Table 4 Sprint-Wise Project Schedule (Gantt Summary)</w:t>
       </w:r>
       <w:r>
-        <w:rPr>
-          <w:rFonts w:ascii="Times New Roman" w:hAnsi="Times New Roman"/>
-          <w:sz w:val="22"/>
-        </w:rPr>
         <w:tab/>
       </w:r>
       <w:r>
         <w:rPr>
           <w:rFonts w:ascii="Times New Roman" w:hAnsi="Times New Roman"/>
+          <w:color w:val="000000"/>
           <w:sz w:val="22"/>
         </w:rPr>
-        <w:t>18</w:t>
+        <w:t>20</w:t>
       </w:r>
     </w:p>
     <w:p>
       <w:pPr>
+        <w:spacing w:before="40" w:after="40" w:lineRule="auto" w:line="276"/>
+        <w:ind w:left="576"/>
         <w:tabs>
-          <w:tab w:pos="8669" w:val="right" w:leader="dot"/>
+          <w:tab w:val="right" w:leader="dot" w:pos="8668"/>
         </w:tabs>
-        <w:spacing w:before="40" w:after="40" w:line="276" w:lineRule="auto"/>
       </w:pPr>
       <w:r>
         <w:rPr>
           <w:rFonts w:ascii="Times New Roman" w:hAnsi="Times New Roman"/>
+          <w:b w:val="0"/>
+          <w:color w:val="000000"/>
           <w:sz w:val="22"/>
         </w:rPr>
-        <w:t>Table 5</w:t>
-        <w:tab/>
-        <w:t>Tools &amp; Technologies Reference Matrix</w:t>
+        <w:t>Table 5 Tools &amp; Technologies Reference Matrix</w:t>
       </w:r>
       <w:r>
-        <w:rPr>
-          <w:rFonts w:ascii="Times New Roman" w:hAnsi="Times New Roman"/>
-          <w:sz w:val="22"/>
-        </w:rPr>
         <w:tab/>
       </w:r>
       <w:r>
         <w:rPr>
           <w:rFonts w:ascii="Times New Roman" w:hAnsi="Times New Roman"/>
-          <w:sz w:val="22"/>
-        </w:rPr>
-        <w:t>22</w:t>
-      </w:r>
-    </w:p>
-    <w:p>
-      <w:pPr>
-        <w:tabs>
-          <w:tab w:pos="8669" w:val="right" w:leader="dot"/>
-        </w:tabs>
-        <w:spacing w:before="40" w:after="40" w:line="276" w:lineRule="auto"/>
-      </w:pPr>
-      <w:r>
-        <w:rPr>
-          <w:rFonts w:ascii="Times New Roman" w:hAnsi="Times New Roman"/>
-          <w:sz w:val="22"/>
-        </w:rPr>
-        <w:t>Table 6</w:t>
-        <w:tab/>
-        <w:t>Hardware &amp; Software Platform Specifications</w:t>
-      </w:r>
-      <w:r>
-        <w:rPr>
-          <w:rFonts w:ascii="Times New Roman" w:hAnsi="Times New Roman"/>
-          <w:sz w:val="22"/>
-        </w:rPr>
-        <w:tab/>
-      </w:r>
-      <w:r>
-        <w:rPr>
-          <w:rFonts w:ascii="Times New Roman" w:hAnsi="Times New Roman"/>
+          <w:color w:val="000000"/>
           <w:sz w:val="22"/>
         </w:rPr>
         <w:t>24</w:t>
@@ -2696,123 +2678,57 @@
     </w:p>
     <w:p>
       <w:pPr>
+        <w:spacing w:before="40" w:after="40" w:lineRule="auto" w:line="276"/>
+        <w:ind w:left="576"/>
         <w:tabs>
-          <w:tab w:pos="8669" w:val="right" w:leader="dot"/>
+          <w:tab w:val="right" w:leader="dot" w:pos="8668"/>
         </w:tabs>
-        <w:spacing w:before="40" w:after="40" w:line="276" w:lineRule="auto"/>
       </w:pPr>
       <w:r>
         <w:rPr>
           <w:rFonts w:ascii="Times New Roman" w:hAnsi="Times New Roman"/>
+          <w:b w:val="0"/>
+          <w:color w:val="000000"/>
           <w:sz w:val="22"/>
         </w:rPr>
-        <w:t>Table 7</w:t>
-        <w:tab/>
-        <w:t>Data Dictionary — users Table</w:t>
+        <w:t>Table 6 Hardware &amp; Software Platform Specifications</w:t>
       </w:r>
       <w:r>
-        <w:rPr>
-          <w:rFonts w:ascii="Times New Roman" w:hAnsi="Times New Roman"/>
-          <w:sz w:val="22"/>
-        </w:rPr>
         <w:tab/>
       </w:r>
       <w:r>
         <w:rPr>
           <w:rFonts w:ascii="Times New Roman" w:hAnsi="Times New Roman"/>
+          <w:color w:val="000000"/>
           <w:sz w:val="22"/>
         </w:rPr>
-        <w:t>38</w:t>
+        <w:t>27</w:t>
       </w:r>
     </w:p>
     <w:p>
       <w:pPr>
+        <w:spacing w:before="40" w:after="40" w:lineRule="auto" w:line="276"/>
+        <w:ind w:left="576"/>
         <w:tabs>
-          <w:tab w:pos="8669" w:val="right" w:leader="dot"/>
+          <w:tab w:val="right" w:leader="dot" w:pos="8668"/>
         </w:tabs>
-        <w:spacing w:before="40" w:after="40" w:line="276" w:lineRule="auto"/>
       </w:pPr>
       <w:r>
         <w:rPr>
           <w:rFonts w:ascii="Times New Roman" w:hAnsi="Times New Roman"/>
+          <w:b w:val="0"/>
+          <w:color w:val="000000"/>
           <w:sz w:val="22"/>
         </w:rPr>
-        <w:t>Table 8</w:t>
-        <w:tab/>
-        <w:t>Data Dictionary — class_sections Table</w:t>
+        <w:t>Table 7 Data Dictionary — users Table</w:t>
       </w:r>
       <w:r>
-        <w:rPr>
-          <w:rFonts w:ascii="Times New Roman" w:hAnsi="Times New Roman"/>
-          <w:sz w:val="22"/>
-        </w:rPr>
         <w:tab/>
       </w:r>
       <w:r>
         <w:rPr>
           <w:rFonts w:ascii="Times New Roman" w:hAnsi="Times New Roman"/>
-          <w:sz w:val="22"/>
-        </w:rPr>
-        <w:t>39</w:t>
-      </w:r>
-    </w:p>
-    <w:p>
-      <w:pPr>
-        <w:tabs>
-          <w:tab w:pos="8669" w:val="right" w:leader="dot"/>
-        </w:tabs>
-        <w:spacing w:before="40" w:after="40" w:line="276" w:lineRule="auto"/>
-      </w:pPr>
-      <w:r>
-        <w:rPr>
-          <w:rFonts w:ascii="Times New Roman" w:hAnsi="Times New Roman"/>
-          <w:sz w:val="22"/>
-        </w:rPr>
-        <w:t>Table 9</w:t>
-        <w:tab/>
-        <w:t>Data Dictionary — students Table</w:t>
-      </w:r>
-      <w:r>
-        <w:rPr>
-          <w:rFonts w:ascii="Times New Roman" w:hAnsi="Times New Roman"/>
-          <w:sz w:val="22"/>
-        </w:rPr>
-        <w:tab/>
-      </w:r>
-      <w:r>
-        <w:rPr>
-          <w:rFonts w:ascii="Times New Roman" w:hAnsi="Times New Roman"/>
-          <w:sz w:val="22"/>
-        </w:rPr>
-        <w:t>40</w:t>
-      </w:r>
-    </w:p>
-    <w:p>
-      <w:pPr>
-        <w:tabs>
-          <w:tab w:pos="8669" w:val="right" w:leader="dot"/>
-        </w:tabs>
-        <w:spacing w:before="40" w:after="40" w:line="276" w:lineRule="auto"/>
-      </w:pPr>
-      <w:r>
-        <w:rPr>
-          <w:rFonts w:ascii="Times New Roman" w:hAnsi="Times New Roman"/>
-          <w:sz w:val="22"/>
-        </w:rPr>
-        <w:t>Table 10</w:t>
-        <w:tab/>
-        <w:t>Data Dictionary — register_scans Table</w:t>
-      </w:r>
-      <w:r>
-        <w:rPr>
-          <w:rFonts w:ascii="Times New Roman" w:hAnsi="Times New Roman"/>
-          <w:sz w:val="22"/>
-        </w:rPr>
-        <w:tab/>
-      </w:r>
-      <w:r>
-        <w:rPr>
-          <w:rFonts w:ascii="Times New Roman" w:hAnsi="Times New Roman"/>
+          <w:color w:val="000000"/>
           <w:sz w:val="22"/>
         </w:rPr>
         <w:t>41</w:t>
@@ -2820,30 +2736,28 @@
     </w:p>
     <w:p>
       <w:pPr>
+        <w:spacing w:before="40" w:after="40" w:lineRule="auto" w:line="276"/>
+        <w:ind w:left="576"/>
         <w:tabs>
-          <w:tab w:pos="8669" w:val="right" w:leader="dot"/>
+          <w:tab w:val="right" w:leader="dot" w:pos="8668"/>
         </w:tabs>
-        <w:spacing w:before="40" w:after="40" w:line="276" w:lineRule="auto"/>
       </w:pPr>
       <w:r>
         <w:rPr>
           <w:rFonts w:ascii="Times New Roman" w:hAnsi="Times New Roman"/>
+          <w:b w:val="0"/>
+          <w:color w:val="000000"/>
           <w:sz w:val="22"/>
         </w:rPr>
-        <w:t>Table 11</w:t>
-        <w:tab/>
-        <w:t>Data Dictionary — attendance_records Table</w:t>
+        <w:t>Table 8 Data Dictionary — class_sections Table</w:t>
       </w:r>
       <w:r>
-        <w:rPr>
-          <w:rFonts w:ascii="Times New Roman" w:hAnsi="Times New Roman"/>
-          <w:sz w:val="22"/>
-        </w:rPr>
         <w:tab/>
       </w:r>
       <w:r>
         <w:rPr>
           <w:rFonts w:ascii="Times New Roman" w:hAnsi="Times New Roman"/>
+          <w:color w:val="000000"/>
           <w:sz w:val="22"/>
         </w:rPr>
         <w:t>42</w:t>
@@ -2851,30 +2765,28 @@
     </w:p>
     <w:p>
       <w:pPr>
+        <w:spacing w:before="40" w:after="40" w:lineRule="auto" w:line="276"/>
+        <w:ind w:left="576"/>
         <w:tabs>
-          <w:tab w:pos="8669" w:val="right" w:leader="dot"/>
+          <w:tab w:val="right" w:leader="dot" w:pos="8668"/>
         </w:tabs>
-        <w:spacing w:before="40" w:after="40" w:line="276" w:lineRule="auto"/>
       </w:pPr>
       <w:r>
         <w:rPr>
           <w:rFonts w:ascii="Times New Roman" w:hAnsi="Times New Roman"/>
+          <w:b w:val="0"/>
+          <w:color w:val="000000"/>
           <w:sz w:val="22"/>
         </w:rPr>
-        <w:t>Table 12</w:t>
-        <w:tab/>
-        <w:t>Data Dictionary — fee_structures Table</w:t>
+        <w:t>Table 9 Data Dictionary — students Table</w:t>
       </w:r>
       <w:r>
-        <w:rPr>
-          <w:rFonts w:ascii="Times New Roman" w:hAnsi="Times New Roman"/>
-          <w:sz w:val="22"/>
-        </w:rPr>
         <w:tab/>
       </w:r>
       <w:r>
         <w:rPr>
           <w:rFonts w:ascii="Times New Roman" w:hAnsi="Times New Roman"/>
+          <w:color w:val="000000"/>
           <w:sz w:val="22"/>
         </w:rPr>
         <w:t>43</w:t>
@@ -2882,61 +2794,28 @@
     </w:p>
     <w:p>
       <w:pPr>
+        <w:spacing w:before="40" w:after="40" w:lineRule="auto" w:line="276"/>
+        <w:ind w:left="576"/>
         <w:tabs>
-          <w:tab w:pos="8669" w:val="right" w:leader="dot"/>
+          <w:tab w:val="right" w:leader="dot" w:pos="8668"/>
         </w:tabs>
-        <w:spacing w:before="40" w:after="40" w:line="276" w:lineRule="auto"/>
       </w:pPr>
       <w:r>
         <w:rPr>
           <w:rFonts w:ascii="Times New Roman" w:hAnsi="Times New Roman"/>
+          <w:b w:val="0"/>
+          <w:color w:val="000000"/>
           <w:sz w:val="22"/>
         </w:rPr>
-        <w:t>Table 13</w:t>
-        <w:tab/>
-        <w:t>Data Dictionary — fee_invoices Table</w:t>
+        <w:t>Table 10 Data Dictionary — register_scans Table</w:t>
       </w:r>
       <w:r>
-        <w:rPr>
-          <w:rFonts w:ascii="Times New Roman" w:hAnsi="Times New Roman"/>
-          <w:sz w:val="22"/>
-        </w:rPr>
         <w:tab/>
       </w:r>
       <w:r>
         <w:rPr>
           <w:rFonts w:ascii="Times New Roman" w:hAnsi="Times New Roman"/>
-          <w:sz w:val="22"/>
-        </w:rPr>
-        <w:t>43</w:t>
-      </w:r>
-    </w:p>
-    <w:p>
-      <w:pPr>
-        <w:tabs>
-          <w:tab w:pos="8669" w:val="right" w:leader="dot"/>
-        </w:tabs>
-        <w:spacing w:before="40" w:after="40" w:line="276" w:lineRule="auto"/>
-      </w:pPr>
-      <w:r>
-        <w:rPr>
-          <w:rFonts w:ascii="Times New Roman" w:hAnsi="Times New Roman"/>
-          <w:sz w:val="22"/>
-        </w:rPr>
-        <w:t>Table 14</w:t>
-        <w:tab/>
-        <w:t>Data Dictionary — timetable_entries Table</w:t>
-      </w:r>
-      <w:r>
-        <w:rPr>
-          <w:rFonts w:ascii="Times New Roman" w:hAnsi="Times New Roman"/>
-          <w:sz w:val="22"/>
-        </w:rPr>
-        <w:tab/>
-      </w:r>
-      <w:r>
-        <w:rPr>
-          <w:rFonts w:ascii="Times New Roman" w:hAnsi="Times New Roman"/>
+          <w:color w:val="000000"/>
           <w:sz w:val="22"/>
         </w:rPr>
         <w:t>44</w:t>
@@ -2944,33 +2823,147 @@
     </w:p>
     <w:p>
       <w:pPr>
+        <w:spacing w:before="40" w:after="40" w:lineRule="auto" w:line="276"/>
+        <w:ind w:left="576"/>
         <w:tabs>
-          <w:tab w:pos="8669" w:val="right" w:leader="dot"/>
+          <w:tab w:val="right" w:leader="dot" w:pos="8668"/>
         </w:tabs>
-        <w:spacing w:before="40" w:after="40" w:line="276" w:lineRule="auto"/>
       </w:pPr>
       <w:r>
         <w:rPr>
           <w:rFonts w:ascii="Times New Roman" w:hAnsi="Times New Roman"/>
+          <w:b w:val="0"/>
+          <w:color w:val="000000"/>
           <w:sz w:val="22"/>
         </w:rPr>
-        <w:t>Table 15</w:t>
-        <w:tab/>
-        <w:t>Data Dictionary — in_app_notifications Table</w:t>
+        <w:t>Table 11 Data Dictionary — attendance_records Table</w:t>
       </w:r>
       <w:r>
-        <w:rPr>
-          <w:rFonts w:ascii="Times New Roman" w:hAnsi="Times New Roman"/>
-          <w:sz w:val="22"/>
-        </w:rPr>
         <w:tab/>
       </w:r>
       <w:r>
         <w:rPr>
           <w:rFonts w:ascii="Times New Roman" w:hAnsi="Times New Roman"/>
+          <w:color w:val="000000"/>
           <w:sz w:val="22"/>
         </w:rPr>
         <w:t>45</w:t>
+      </w:r>
+    </w:p>
+    <w:p>
+      <w:pPr>
+        <w:spacing w:before="40" w:after="40" w:lineRule="auto" w:line="276"/>
+        <w:ind w:left="576"/>
+        <w:tabs>
+          <w:tab w:val="right" w:leader="dot" w:pos="8668"/>
+        </w:tabs>
+      </w:pPr>
+      <w:r>
+        <w:rPr>
+          <w:rFonts w:ascii="Times New Roman" w:hAnsi="Times New Roman"/>
+          <w:b w:val="0"/>
+          <w:color w:val="000000"/>
+          <w:sz w:val="22"/>
+        </w:rPr>
+        <w:t>Table 12 Data Dictionary — fee_structures Table</w:t>
+      </w:r>
+      <w:r>
+        <w:tab/>
+      </w:r>
+      <w:r>
+        <w:rPr>
+          <w:rFonts w:ascii="Times New Roman" w:hAnsi="Times New Roman"/>
+          <w:color w:val="000000"/>
+          <w:sz w:val="22"/>
+        </w:rPr>
+        <w:t>46</w:t>
+      </w:r>
+    </w:p>
+    <w:p>
+      <w:pPr>
+        <w:spacing w:before="40" w:after="40" w:lineRule="auto" w:line="276"/>
+        <w:ind w:left="576"/>
+        <w:tabs>
+          <w:tab w:val="right" w:leader="dot" w:pos="8668"/>
+        </w:tabs>
+      </w:pPr>
+      <w:r>
+        <w:rPr>
+          <w:rFonts w:ascii="Times New Roman" w:hAnsi="Times New Roman"/>
+          <w:b w:val="0"/>
+          <w:color w:val="000000"/>
+          <w:sz w:val="22"/>
+        </w:rPr>
+        <w:t>Table 13 Data Dictionary — fee_invoices Table</w:t>
+      </w:r>
+      <w:r>
+        <w:tab/>
+      </w:r>
+      <w:r>
+        <w:rPr>
+          <w:rFonts w:ascii="Times New Roman" w:hAnsi="Times New Roman"/>
+          <w:color w:val="000000"/>
+          <w:sz w:val="22"/>
+        </w:rPr>
+        <w:t>47</w:t>
+      </w:r>
+    </w:p>
+    <w:p>
+      <w:pPr>
+        <w:spacing w:before="40" w:after="40" w:lineRule="auto" w:line="276"/>
+        <w:ind w:left="576"/>
+        <w:tabs>
+          <w:tab w:val="right" w:leader="dot" w:pos="8668"/>
+        </w:tabs>
+      </w:pPr>
+      <w:r>
+        <w:rPr>
+          <w:rFonts w:ascii="Times New Roman" w:hAnsi="Times New Roman"/>
+          <w:b w:val="0"/>
+          <w:color w:val="000000"/>
+          <w:sz w:val="22"/>
+        </w:rPr>
+        <w:t>Table 14 Data Dictionary — timetable_entries Table</w:t>
+      </w:r>
+      <w:r>
+        <w:tab/>
+      </w:r>
+      <w:r>
+        <w:rPr>
+          <w:rFonts w:ascii="Times New Roman" w:hAnsi="Times New Roman"/>
+          <w:color w:val="000000"/>
+          <w:sz w:val="22"/>
+        </w:rPr>
+        <w:t>48</w:t>
+      </w:r>
+    </w:p>
+    <w:p>
+      <w:pPr>
+        <w:spacing w:before="40" w:after="40" w:lineRule="auto" w:line="276"/>
+        <w:ind w:left="576"/>
+        <w:tabs>
+          <w:tab w:val="right" w:leader="dot" w:pos="8668"/>
+        </w:tabs>
+      </w:pPr>
+      <w:r>
+        <w:rPr>
+          <w:rFonts w:ascii="Times New Roman" w:hAnsi="Times New Roman"/>
+          <w:b w:val="0"/>
+          <w:color w:val="000000"/>
+          <w:sz w:val="22"/>
+        </w:rPr>
+        <w:t>Table 15 Data Dictionary — in_app_notifications Table</w:t>
+      </w:r>
+      <w:r>
+        <w:tab/>
+      </w:r>
+      <w:r>
+        <w:rPr>
+          <w:rFonts w:ascii="Times New Roman" w:hAnsi="Times New Roman"/>
+          <w:color w:val="000000"/>
+          <w:sz w:val="22"/>
+        </w:rPr>
+        <w:t>49</w:t>
       </w:r>
     </w:p>
     <w:p>

</xml_diff>